<commit_message>
B2B hook without fit sentence, target customers and partners, deeper B2C audience; new exemplars
Co-Authored-By: Claude Opus 5.5 <noreply@anthropic.com>
Claude-Session: https://claude.ai/code/session_01QxiGiYZoWrs63N5DrrSBU6
</commit_message>
<xml_diff>
--- a/f1run/toolkit/F1 Merge Master v7 - B2B no reference.docx
+++ b/f1run/toolkit/F1 Merge Master v7 - B2B no reference.docx
@@ -52,7 +52,7 @@
         </w:r>
       </w:fldSimple>
       <w:r>
-        <w:t xml:space="preserve">, and </w:t>
+        <w:t xml:space="preserve">, and I wanted to share why this could make sense for </w:t>
       </w:r>
       <w:fldSimple w:instr=" MERGEFIELD Company \* MERGEFORMAT ">
         <w:r>
@@ -60,13 +60,8 @@
         </w:r>
       </w:fldSimple>
       <w:r>
-        <w:t xml:space="preserve"> was identified as a potential fit </w:t>
+        <w:t>.</w:t>
       </w:r>
-      <w:fldSimple w:instr=" MERGEFIELD Fit_reason \* MERGEFORMAT ">
-        <w:r>
-          <w:t>«Fit_reason»</w:t>
-        </w:r>
-      </w:fldSimple>
     </w:p>
     <w:p>
       <w:pPr>

</xml_diff>

<commit_message>
Value-led market reference and B2B pipeline bullet; masters rebuilt
Co-Authored-By: Claude Opus 5.5 <noreply@anthropic.com>
Claude-Session: https://claude.ai/code/session_01QxiGiYZoWrs63N5DrrSBU6
</commit_message>
<xml_diff>
--- a/f1run/toolkit/F1 Merge Master v7 - B2B no reference.docx
+++ b/f1run/toolkit/F1 Merge Master v7 - B2B no reference.docx
@@ -126,6 +126,28 @@
       <w:fldSimple w:instr=" MERGEFIELD Shared_values \* MERGEFORMAT ">
         <w:r>
           <w:t>«Shared_values»</w:t>
+        </w:r>
+      </w:fldSimple>
+    </w:p>
+    <w:p>
+      <w:pPr>
+        <w:spacing w:line="360" w:lineRule="auto" w:before="0" w:after="0"/>
+      </w:pPr>
+    </w:p>
+    <w:p>
+      <w:pPr>
+        <w:pStyle w:val="ListBullet"/>
+        <w:spacing w:line="360" w:lineRule="auto" w:before="0" w:after="0"/>
+      </w:pPr>
+      <w:r>
+        <w:rPr>
+          <w:b/>
+        </w:rPr>
+        <w:t xml:space="preserve">Enterprise Pipeline &amp; B2B Activations: </w:t>
+      </w:r>
+      <w:fldSimple w:instr=" MERGEFIELD Pipeline \* MERGEFORMAT ">
+        <w:r>
+          <w:t>«Pipeline»</w:t>
         </w:r>
       </w:fldSimple>
     </w:p>

</xml_diff>

<commit_message>
Fold B2B pipeline into target audience; remove pipeline bullet
Co-Authored-By: Claude Opus 5.5 <noreply@anthropic.com>
Claude-Session: https://claude.ai/code/session_01QxiGiYZoWrs63N5DrrSBU6
</commit_message>
<xml_diff>
--- a/f1run/toolkit/F1 Merge Master v7 - B2B no reference.docx
+++ b/f1run/toolkit/F1 Merge Master v7 - B2B no reference.docx
@@ -126,28 +126,6 @@
       <w:fldSimple w:instr=" MERGEFIELD Shared_values \* MERGEFORMAT ">
         <w:r>
           <w:t>«Shared_values»</w:t>
-        </w:r>
-      </w:fldSimple>
-    </w:p>
-    <w:p>
-      <w:pPr>
-        <w:spacing w:line="360" w:lineRule="auto" w:before="0" w:after="0"/>
-      </w:pPr>
-    </w:p>
-    <w:p>
-      <w:pPr>
-        <w:pStyle w:val="ListBullet"/>
-        <w:spacing w:line="360" w:lineRule="auto" w:before="0" w:after="0"/>
-      </w:pPr>
-      <w:r>
-        <w:rPr>
-          <w:b/>
-        </w:rPr>
-        <w:t xml:space="preserve">Enterprise Pipeline &amp; B2B Activations: </w:t>
-      </w:r>
-      <w:fldSimple w:instr=" MERGEFIELD Pipeline \* MERGEFORMAT ">
-        <w:r>
-          <w:t>«Pipeline»</w:t>
         </w:r>
       </w:fldSimple>
     </w:p>

</xml_diff>

<commit_message>
B2B standard revision 6: 'identified for the following reasons' hook, no stats, sector-true names
Co-Authored-By: Claude Opus 5.5 <noreply@anthropic.com>
Claude-Session: https://claude.ai/code/session_01QxiGiYZoWrs63N5DrrSBU6
</commit_message>
<xml_diff>
--- a/f1run/toolkit/F1 Merge Master v7 - B2B no reference.docx
+++ b/f1run/toolkit/F1 Merge Master v7 - B2B no reference.docx
@@ -52,7 +52,7 @@
         </w:r>
       </w:fldSimple>
       <w:r>
-        <w:t xml:space="preserve">, and I wanted to share why this could make sense for </w:t>
+        <w:t xml:space="preserve">, and </w:t>
       </w:r>
       <w:fldSimple w:instr=" MERGEFIELD Company \* MERGEFORMAT ">
         <w:r>
@@ -60,7 +60,7 @@
         </w:r>
       </w:fldSimple>
       <w:r>
-        <w:t>.</w:t>
+        <w:t xml:space="preserve"> was identified for the following reasons:</w:t>
       </w:r>
     </w:p>
     <w:p>

</xml_diff>